<commit_message>
1Timothy audit: 79 text fixes + 8 title/metadata fixes, all 8 gates pass
- EN 48, KO 31 text fixes vs MSG (1:8-11 guidance/counsel, 2:1-3 prayer manner,
  2:4-7 Priest-Mediator/everyone/future tense, 2:8-10 holy hands, 2:11-15
  salvation/holiness, 3:1-7 Leadership header/wine/gentle, 3:8-13 mystery/
  sharp-tongued/spouses/children, 3:14-16 invisible Spirit/proclaimed/ascension,
  4:1-5 holy, 4:6-10 far more useful, 4:11-14 gift of ministry, 5 extended
  family/bad-to-worse/no taking sides/self-check, 6:13-16 Master/High King/
  eternal rule, 6:20-21 talk-show religion)
- Fixed broken EN ch3/ch5 chapter titles; filled 6 empty KO chapter titles
- verify_pairing_content.py: handle chained continued-ref rows (3-way split ch1)
- completeness FPs documented; merge-split candidates: 0 new, 2 applied-pre recorded
</commit_message>
<xml_diff>
--- a/gdocs_build/1Timothy.docx
+++ b/gdocs_build/1Timothy.docx
@@ -124,7 +124,7 @@
               <w:rPr>
                 <w:sz w:val="18"/>
               </w:rPr>
-              <w:t>Hey, what up! It's Paul, an apostle on a special mission for Jesus, the guy who gives us major hope. God our Savior gave me the orders, and I'm writing this to you, Timothy, my awesome apprentice in the faith. Hope you're getting all the positive energy from God and Jesus!</w:t>
+              <w:t>Hey, what up! It's Paul, an apostle on a special mission for Jesus, the guy who gives us major hope. God our Savior gave me the orders, and I'm writing this to you, Timothy, my son in the faith. Hope you're getting all the positive energy from God and Jesus!</w:t>
             </w:r>
           </w:p>
         </w:tc>
@@ -400,7 +400,7 @@
               <w:rPr>
                 <w:sz w:val="18"/>
               </w:rPr>
-              <w:t>Look, rules are important, but it's all about who you're talking to and how you say it. The rules aren't really for people who are already doing the right thing. They're for the rebels, the ones who disrespect God, life, sex, and the truth. They're for the people who mock the awesome message that God put me in charge of.</w:t>
+              <w:t>Look, guidance and counsel definitely have their place, but it's all about who you're talking to and how you say it. The rules aren't really for people who are already doing the right thing. They're for the rebels, the ones who disrespect God, life, sex, and the truth. They're for the people who mock the awesome message that this great God put me in charge of.</w:t>
             </w:r>
           </w:p>
         </w:tc>
@@ -423,7 +423,7 @@
               <w:rPr>
                 <w:sz w:val="18"/>
               </w:rPr>
-              <w:t>규칙이 중요하긴 해. 근데 누구에게 어떻게 말하느냐도 뭐라고 말하느냐만큼 중요해. 규칙은 원래 잘 사는 사람들을 위한 게 아니야. 하나님과 삶과 성과 진리를 무시하는 반항아들, 하나님께서 내게 맡기신 멋진 메시지를 비웃는 사람들을 위한 거야.</w:t>
+              <w:t>가르침과 조언은 분명 필요하긴 해. 근데 누구에게 어떻게 말하느냐도 뭐라고 말하느냐만큼 중요해. 규칙은 원래 잘 사는 사람들을 위한 게 아니야. 하나님과 삶과 성과 진리를 무시하는 반항아들, 위대하신 하나님께서 내게 맡기신 멋진 메시지를 비웃는 사람들을 위한 거야.</w:t>
             </w:r>
           </w:p>
         </w:tc>
@@ -471,7 +471,7 @@
               <w:rPr>
                 <w:sz w:val="18"/>
               </w:rPr>
-              <w:t>Speaking of which, I'm so stoked that Christ Jesus trusted me with this gig. He totally went out on a limb for me. Before, I was a total wrecking ball, going after believers and being super arrogant. But God showed me mercy because I was clueless and didn't know who I was messing with. Then, BAM! Grace, faith, and love just flooded my life, all because of Jesus.</w:t>
+              <w:t>Speaking of which, I'm so stoked that Christ Jesus made me up to the task and trusted me with this gig. He totally went out on a limb for me. Before, I was a total wrecking ball, going after believers and being super arrogant. But God showed me mercy because I was clueless and didn't know who I was messing with. Then, BAM! Grace, faith, and love just flooded my life, all because of Jesus.</w:t>
             </w:r>
           </w:p>
         </w:tc>
@@ -494,7 +494,7 @@
               <w:rPr>
                 <w:sz w:val="18"/>
               </w:rPr>
-              <w:t>그런 의미에서, 그리스도 예수님께서 나를 믿고 이 일을 맡겨 주신 게 너무 감사해. 정말 나한테 크게 베팅해 주신 거야. 예전엔 나 완전 망나니였어. 믿는 사람들을 쫓아다니고 엄청 건방졌지. 근데 하나님이 나를 불쌍히 여기셨어. 내가 뭘 하는지도, 누구를 건드리는지도 몰랐거든. 그러다 팡! 은혜와 믿음과 사랑이 내 삶에 확 쏟아졌어. 다 예수님 덕분이야.</w:t>
+              <w:t>그런 의미에서, 그리스도 예수님께서 나를 이 일에 합당한 사람으로 빚어 주시고 맡겨 주신 게 너무 감사해. 정말 나한테 크게 베팅해 주신 거야. 예전엔 나 완전 망나니였어. 믿는 사람들을 쫓아다니고 엄청 건방졌지. 근데 하나님이 나를 불쌍히 여기셨어. 내가 뭘 하는지도, 누구를 건드리는지도 몰랐거든. 그러다 팡! 은혜와 믿음과 사랑이 내 삶에 확 쏟아졌어. 다 예수님 덕분이야.</w:t>
             </w:r>
           </w:p>
         </w:tc>
@@ -558,7 +558,7 @@
               <w:rPr>
                 <w:sz w:val="18"/>
               </w:rPr>
-              <w:t>Here's something you can count on: Jesus Christ came to save sinners, and I'm exhibit A. I was the worst of the worst, and the only reason I'm even here is because of God's insane mercy. Now, he uses me as an example of his never-ending patience for anyone who's thinking about trusting him.</w:t>
+              <w:t>Here's something you can count on: Jesus Christ came into the world to save sinners, and I'm exhibit A. I was the worst of the worst, and the only reason I'm even here is because of God's insane mercy. Now, he uses me as an example of his never-ending patience for anyone who's right on the edge of trusting him forever.</w:t>
             </w:r>
           </w:p>
         </w:tc>
@@ -581,7 +581,7 @@
               <w:rPr>
                 <w:sz w:val="18"/>
               </w:rPr>
-              <w:t>이건 진짜 믿어도 돼: 예수 그리스도께서 죄인들을 구하러 이 세상에 오셨어. 그리고 내가 바로 그 증거 1호야. 나만큼 최악인 사람도 없었는데, 하나님의 어마어마한 자비 덕분에 여기 있는 거야. 이제 하나님은 나를 끝없는 인내의 본보기로 쓰셔서, 하나님을 믿을까 말까 하는 사람들에게 보여 주셔.</w:t>
+              <w:t>이건 진짜 믿어도 돼: 예수 그리스도께서 죄인들을 구하러 이 세상에 오셨어. 그리고 내가 바로 그 증거 1호야. 나만큼 최악인 사람도 없었는데, 하나님의 어마어마한 자비 덕분에 여기 있는 거야. 이제 하나님은 나를 끝없는 인내의 본보기로 쓰셔서, 영원히 믿을지 말지, 아슬아슬하게 고민하는 사람들에게 보여 주셔.</w:t>
             </w:r>
           </w:p>
         </w:tc>
@@ -629,7 +629,7 @@
               <w:rPr>
                 <w:sz w:val="18"/>
               </w:rPr>
-              <w:t>So, major props and glory to the King of everything, the one and only God who's immortal and invisible, forever and ever. Amen!</w:t>
+              <w:t>So, major props and glory to the King of all time, the one and only God who's immortal and invisible, forever and ever. Amen!</w:t>
             </w:r>
           </w:p>
         </w:tc>
@@ -652,7 +652,7 @@
               <w:rPr>
                 <w:sz w:val="18"/>
               </w:rPr>
-              <w:t>만왕의 왕, 유일하신 하나님, 죽지 않으시고 눈에 보이지 않으신 분께 최고의 영광을! 영원히 아멘!</w:t>
+              <w:t>영원의 왕, 유일하신 하나님, 죽지 않으시고 눈에 보이지 않으신 분께 최고의 영광을! 영원히 아멘!</w:t>
             </w:r>
           </w:p>
         </w:tc>
@@ -700,7 +700,7 @@
               <w:rPr>
                 <w:sz w:val="18"/>
               </w:rPr>
-              <w:t>I'm passing the torch to you, my man Timothy. All the things that were prophesied about you were getting you ready for this. All those prayers are coming together now so you can crush this mission. Be a warrior, hold on tight to your faith, and be true to yourself. This is a battle, after all.</w:t>
+              <w:t>I'm passing the torch to you, my man Timothy. All the things that were prophesied about you were getting us ready for this. All those prayers are coming together now so you can crush this mission, fearless in the struggle. Be a warrior, hold on tight to your faith, and be true to yourself. This is a battle, after all.</w:t>
             </w:r>
           </w:p>
         </w:tc>
@@ -723,7 +723,7 @@
               <w:rPr>
                 <w:sz w:val="18"/>
               </w:rPr>
-              <w:t>디모데, 이제 이 일을 너한테 넘긴다. 너에 대한 예언의 말씀들이 너를 이 일을 위해 준비시켜 왔어. 그 모든 기도가 지금 합쳐져서 네가 이 미션을 멋지게 해낼 수 있게 된 거야. 용감한 전사가 돼. 믿음을 꽉 잡고, 너 자신도 꽉 잡아. 어쨌든 이건 싸움이니까.</w:t>
+              <w:t>디모데, 이제 이 일을 너한테 넘긴다. 너에 대한 예언의 말씀들이 우리를 이 일을 위해 준비시켜 왔어. 그 모든 기도가 지금 합쳐져서 네가 두려움 없이 이 미션을 멋지게 해낼 수 있게 된 거야. 용감한 전사가 돼. 믿음을 꽉 잡고, 너 자신도 꽉 잡아. 어쨌든 이건 싸움이니까.</w:t>
             </w:r>
           </w:p>
         </w:tc>
@@ -771,7 +771,7 @@
               <w:rPr>
                 <w:sz w:val="18"/>
               </w:rPr>
-              <w:t>Some people have already bailed on their faith by being lazy and thinking they can do whatever they want. Hymenaeus and Alexander are a couple of them. I had to hand them over to Satan so they'd learn their lesson and stop disrespecting God.</w:t>
+              <w:t>Some people have totally wrecked their faith by loosening their grip and thinking they can do whatever they want. Hymenaeus and Alexander are a couple of them. I let them wander off to Satan so they'd learn their lesson and stop disrespecting God.</w:t>
             </w:r>
           </w:p>
         </w:tc>
@@ -794,7 +794,7 @@
               <w:rPr>
                 <w:sz w:val="18"/>
               </w:rPr>
-              <w:t>어떤 사람들은 대충 살고 '뭐든 다 돼'라고 생각하다가 믿음을 완전히 망쳐 버렸어. 후메내오와 알렉산더가 그런 경우야. 내가 그들을 사탄에게 넘겨서, 하나님을 모독하지 않도록 교훈을 얻게 해야 했어.</w:t>
+              <w:t>어떤 사람들은 붙잡고 있던 걸 놓고 '뭐든 다 돼'라고 생각하다가 믿음을 완전히 망쳐 버렸어. 후메내오와 알렉산더가 그런 경우야. 내가 그들을 사탄에게 가게 내버려 둬서, 하나님을 모독하지 않도록 교훈을 얻게 했어.</w:t>
             </w:r>
           </w:p>
         </w:tc>
@@ -972,7 +972,7 @@
               <w:rPr>
                 <w:sz w:val="18"/>
               </w:rPr>
-              <w:t>Alright, so first things first, I need you to pray. Like, all the time. Hit up God for everyone you know. And make sure you're praying for the people in charge, like the prez and the government peeps. If they're doing a good job, we can all just chill and live our lives in peace, focusing on God. That's how our Savior God wants us to live, for real.</w:t>
+              <w:t>Alright, so first things first, I need you to pray — every way you know how. Hit up God for everyone you know. And make sure you're praying for the people in charge, like the prez and the government peeps. If they're doing a good job, we can all just chill and live our lives in peace, focusing on God. That's how our Savior God wants us to live, for real.</w:t>
             </w:r>
           </w:p>
         </w:tc>
@@ -995,7 +995,7 @@
               <w:rPr>
                 <w:sz w:val="18"/>
               </w:rPr>
-              <w:t>자, 우선 제일 먼저 할 건 기도야. 진짜 계속 기도해. 아는 사람 모두를 위해 하나님께 기도하고. 특히 나라를 이끄는 사람들, 대통령이나 정부 사람들을 위해 기도해. 그들이 일을 잘하면 우리 모두 편하게 살면서 하나님께 집중할 수 있잖아. 그게 우리 구원자 하나님이 원하시는 삶의 방식이야, 진짜로.</w:t>
+              <w:t>자, 우선 제일 먼저 할 건 기도야. 네가 아는 모든 방법으로 기도해. 아는 사람 모두를 위해 하나님께 기도하고. 특히 나라를 이끄는 사람들, 대통령이나 정부 사람들을 위해 기도해. 그들이 일을 잘하면 우리 모두 편하게 살면서 하나님께 집중할 수 있잖아. 그게 우리 구원자 하나님이 원하시는 삶의 방식이야, 진짜로.</w:t>
             </w:r>
           </w:p>
         </w:tc>
@@ -1043,7 +1043,7 @@
               <w:rPr>
                 <w:sz w:val="18"/>
               </w:rPr>
-              <w:t>God wants to save, like, literally everyone. He wants everyone to get the real scoop: there's only one God, and only one guy who connects us to Him—Jesus. He was the one who put himself on the line, offering himself as a sacrifice to bust us out of the trap of sin. The news is getting out there, and that's my main gig: telling people who've never heard about God what's up, and how to get in on it through simple faith and plain truth.</w:t>
+              <w:t>God wants to save, like, literally everyone. He wants everyone to get the real scoop: there's only one God, and only one Priest-Mediator who connects us to Him — Jesus. He was the one who put himself on the line, offering himself as a sacrifice to bust everyone out of sin's trap and set them all free. The news is going to get out there, and that's my main gig: telling people who've never heard about God what's up, and how to get in on it through simple faith and plain truth.</w:t>
             </w:r>
           </w:p>
         </w:tc>
@@ -1066,7 +1066,7 @@
               <w:rPr>
                 <w:sz w:val="18"/>
               </w:rPr>
-              <w:t>하나님은 진짜 모두를, 말 그대로 모두를 구원하고 싶어 하셔. 모두가 진짜 진실을 알길 원하셔: 하나님은 오직 한 분, 그리고 우리와 하나님을 연결해 주는 분도 오직 한 분, 예수님이야. 죄의 덫에 갇힌 우리 모두를 풀어 주려고 자신을 내어주신 분이지. 그 소식이 퍼지고 있어. 그게 내 주된 일이야: 하나님을 한 번도 들어본 적 없는 사람들에게 소식을 전하고, 단순한 믿음과 분명한 진리로 참여하는 법을 알려 주는 거.</w:t>
+              <w:t>하나님은 진짜 모두를, 말 그대로 모두를 구원하고 싶어 하셔. 모두가 진짜 진실을 알길 원하셔: 하나님은 오직 한 분, 그리고 우리와 하나님을 연결해 주는 분도 오직 한 분, 예수님이야. 죄의 덫에 갇힌 모든 사람을 풀어 주고 자유롭게 하려고 자신을 내어주신 분이지. 그 소식은 결국 퍼질 거야. 그게 내 주된 일이야: 하나님을 한 번도 들어본 적 없는 사람들에게 소식을 전하고, 단순한 믿음과 분명한 진리로 참여하는 법을 알려 주는 거.</w:t>
             </w:r>
           </w:p>
         </w:tc>
@@ -1114,7 +1114,7 @@
               <w:rPr>
                 <w:sz w:val="18"/>
               </w:rPr>
-              <w:t>Since we're talking about prayer, guys, when you pray, do it with positive energy. Don't be shaking your fists all angry at your enemies. Just raise your hands to God. And ladies, you're in on this too. Show up with humility, not all extra with your looks, chasing the latest trends. Do something beautiful for God — that's what makes you beautiful.</w:t>
+              <w:t>Since prayer is what all of this is built on, guys, when you pray, do it with positive energy. Don't be shaking your fists all angry at your enemies. Just raise your holy hands to God. And ladies, you're in on this too. Show up humble before God, not all extra with your looks, chasing the latest trends. Do something beautiful for God — that's what makes you beautiful.</w:t>
             </w:r>
           </w:p>
         </w:tc>
@@ -1137,7 +1137,7 @@
               <w:rPr>
                 <w:sz w:val="18"/>
               </w:rPr>
-              <w:t>기도 얘기가 나왔으니, 남자들은 기도할 때 긍정적인 에너지로 해. 적들한테 주먹질하듯 화내지 말고, 그냥 하나님께 손을 들어 올려. 그리고 여자들도 같이 해. 겸손하게 나와. 외모 꾸미느라 과하게 치장하거나 최신 유행 쫓지 말고. 하나님을 위해 아름다운 일을 하는 것 — 그게 너를 아름답게 만드는 거야.</w:t>
+              <w:t>기도가 이 모든 것의 바탕이니까, 남자들은 기도할 때 긍정적인 에너지로 해. 적들한테 주먹질하듯 화내지 말고, 거룩한 손을 하나님께 들어 올려. 그리고 여자들도 같이 해. 하나님 앞에서 겸손하게 나와. 외모 꾸미느라 과하게 치장하거나 최신 유행 쫓지 말고. 하나님을 위해 아름다운 일을 하는 것 — 그게 너를 아름답게 만드는 거야.</w:t>
             </w:r>
           </w:p>
         </w:tc>
@@ -1185,7 +1185,7 @@
               <w:rPr>
                 <w:sz w:val="18"/>
               </w:rPr>
-              <w:t>In the church gathering, women shouldn't be taking over and bossing the men around. Everyone should be learning quietly and respectfully together. Remember, Adam was created first, then Eve. And Eve was the first to be deceived — our pioneer in sin! — with Adam right on her heels. But look, the whole mom thing brought a huge win in the end, turning things around from Eve's mistake. This salvation, though, only comes to those who stick with trusting God, loving others, and keeping it real as they grow up. You can count on that.</w:t>
+              <w:t>In the church gathering, I'm not letting women take over and boss the men around. Everyone should be learning quietly and respectfully together. Remember, Adam was created first, then Eve. And Eve was the first to be deceived — our pioneer in sin! — with Adam right on her heels. But look, the whole childbearing thing brought salvation in the end, turning things around from Eve's mistake. This salvation, though, only comes to those who stick with trusting God, loving others, and living holy as they grow up. You can count on that.</w:t>
             </w:r>
           </w:p>
         </w:tc>
@@ -1208,7 +1208,7 @@
               <w:rPr>
                 <w:sz w:val="18"/>
               </w:rPr>
-              <w:t>교회 모임에서 여자들이 나서서 남자들에게 명령하지 않았으면 해. 모두가 함께 조용히, 공손하게 배우는 거야. 기억해, 아담이 먼저 창조되고 그다음 하와였어. 그리고 하와가 제일 먼저 속았어 — 죄의 선구자야! — 아담도 바로 뒤따라갔고. 근데 엄마가 된다는 게 결국 큰 승리를 가져왔어. 하와의 실수를 뒤집은 거야. 근데 이 구원은 하나님을 계속 믿고, 사랑하고, 성장하면서 진짜 모습을 지키는 사람들에게만 오는 거야. 이건 믿어도 돼.</w:t>
+              <w:t>교회 모임에서 내가 여자들이 나서서 남자들에게 명령하게 두지 않아. 모두가 함께 조용히, 공손하게 배우는 거야. 기억해, 아담이 먼저 창조되고 그다음 하와였어. 그리고 하와가 제일 먼저 속았어 — 죄의 선구자야! — 아담도 바로 뒤따라갔고. 근데 아이를 낳는다는 게 결국 구원을 가져왔어. 하와의 실수를 뒤집은 거야. 근데 이 구원은 하나님을 계속 믿고, 사랑하고, 성장하면서 거룩함을 지키는 사람들에게만 오는 거야. 이건 믿어도 돼.</w:t>
             </w:r>
           </w:p>
         </w:tc>
@@ -1219,7 +1219,7 @@
         <w:pStyle w:val="Heading1"/>
       </w:pPr>
       <w:r>
-        <w:t>Chapter 3 — How to be a Church honored</w:t>
+        <w:t>Chapter 3 — How to Be a Church Leader</w:t>
       </w:r>
     </w:p>
     <w:tbl>
@@ -1314,7 +1314,7 @@
                 <w:b/>
                 <w:sz w:val="18"/>
               </w:rPr>
-              <w:t>Leaders in the Church</w:t>
+              <w:t>Leadership in the Church</w:t>
             </w:r>
           </w:p>
         </w:tc>
@@ -1338,7 +1338,7 @@
                 <w:b/>
                 <w:sz w:val="18"/>
               </w:rPr>
-              <w:t>교회의 리더들</w:t>
+              <w:t>교회의 리더십</w:t>
             </w:r>
           </w:p>
         </w:tc>
@@ -1386,7 +1386,7 @@
               <w:rPr>
                 <w:sz w:val="18"/>
               </w:rPr>
-              <w:t>So, you wanna be a leader at church? That's legit. But hold up, it's not like they're just handing out special accesses. There are some ground rules. First, you gotta have a good rep. People need to know you're a solid guy. You gotta be a one-woman man, stay chill, and be the kind of guy people can actually talk to, who welcomes people into his home. And yeah, you need to know your stuff when it comes to God. Don't be a party animal, and definitely don't be a bully. Be cool, don't get triggered by everything, and don't be greedy. You've got to have your own life on lock, and your own kids have to actually look up to you. Seriously, if your own house is a mess, how are you gonna run God's house? Also, you can't be a rookie Christian; that's a surefire way to get a big ego and let the Devil trip you up. Even people who aren't into church should think you're a decent guy, or the Devil will find a way to trap you.</w:t>
+              <w:t>So, you wanna be a leader at church? That's legit. But hold up, it's not like they're just handing out special access. There are some ground rules. First, you gotta have a good rep. People need to know you're a solid guy. You gotta be a one-woman man, stay chill, and be the kind of guy people can actually talk to, who welcomes people into his home. And yeah, you need to know your stuff when it comes to God. Don't be hitting the bottle too hard, and definitely don't be pushy. Be gentle, don't get triggered by everything, and don't be greedy. You've got to have your own life on lock, and your own kids have to actually look up to you. Seriously, if your own house is a mess, how are you gonna run God's house? Also, you can't be a rookie Christian; that's a surefire way to get a big ego and let the Devil trip you up. Even people who aren't into church should think you're a decent guy, or the Devil will find a way to trap you.</w:t>
             </w:r>
           </w:p>
         </w:tc>
@@ -1409,7 +1409,7 @@
               <w:rPr>
                 <w:sz w:val="18"/>
               </w:rPr>
-              <w:t>교회에서 리더가 되고 싶어? 좋은 생각이야. 근데 잠깐, 아무나 주는 게 아니야. 기본 조건이 있어. 첫째, 평판이 좋아야 해. 사람들이 너를 믿을 만한 사람으로 알아야지. 한 여자에게 충실하고, 침착하고, 사람들이 편하게 다가갈 수 있고, 손님을 잘 맞이하는 사람이어야 해. 하나님에 대해선 확실히 알아야 하고. 술고래가 아니고, 절대 깡패 짓 하지 말고. 쿨하게, 별거 아닌 일에 욱하지 말고, 탐욕 부리지도 말고. 자기 집안일도 잘 챙기고, 자기 아이들이 진짜로 존경해야 해. 진짜로, 자기 집도 못 건사하면서 어떻게 하나님의 집을 돌보겠어? 또 신앙 초보도 안 돼. 자만심이 하늘을 찌르고 마귀한테 넘어가기 딱 좋아. 교회 안 다니는 사람들한테도 괜찮은 사람으로 보여야 해. 그렇지 않으면 마귀가 널 덫에 빠뜨릴 방법을 찾을 거야.</w:t>
+              <w:t>교회에서 리더가 되고 싶어? 좋은 생각이야. 근데 잠깐, 아무나 주는 게 아니야. 기본 조건이 있어. 첫째, 평판이 좋아야 해. 사람들이 너를 믿을 만한 사람으로 알아야지. 한 여자에게 충실하고, 침착하고, 사람들이 편하게 다가갈 수 있고, 손님을 잘 맞이하는 사람이어야 해. 하나님에 대해선 확실히 알아야 하고. 술고래가 아니고, 밀어붙이지 말고, 부드럽게, 별거 아닌 일에 욱하지 말고, 탐욕 부리지도 말고. 자기 집안일도 잘 챙기고, 자기 아이들이 진짜로 존경해야 해. 진짜로, 자기 집도 못 건사하면서 어떻게 하나님의 집을 돌보겠어? 또 신앙 초보도 안 돼. 자만심이 하늘을 찌르고 마귀한테 넘어가기 딱 좋아. 교회 안 다니는 사람들한테도 괜찮은 사람으로 보여야 해. 그렇지 않으면 마귀가 널 덫에 빠뜨릴 방법을 찾을 거야.</w:t>
             </w:r>
           </w:p>
         </w:tc>
@@ -1457,7 +1457,7 @@
               <w:rPr>
                 <w:sz w:val="18"/>
               </w:rPr>
-              <w:t>And the same goes for the church's support crew, the deacons. These guys need to be the real deal—no fakes, no drama. They can't be hitting the bottle too hard or just in it for the perks. They have to be all-in on the big mysteries of the faith and not just trying to climb the ladder. They gotta prove themselves first. If they've got the right stuff, then they're in. And this isn't a boys-only club; the ladies have to meet the same standards. They need to be serious, trustworthy, and not spreading gossip or drinking too much. The whole crew needs to be loyal to their families and have their lives in order. When you serve like that, you get major respect and make the whole Jesus-faith look good.</w:t>
+              <w:t>And the same goes for the church's support crew, the deacons. These guys need to be the real deal—no fakes, no drama. They can't be hitting the bottle too hard or just in it for the perks. They have to be in awe of the mystery of the faith and not using their position to try to run things. They gotta prove themselves first. If they've got the right stuff, then they're in. And this isn't a boys-only club; the ladies have to meet the same standards. They need to be serious, trustworthy, and not running their mouths or drinking too much. The whole crew needs to be loyal to their spouses attentive to their kids, and have their lives in order. When you serve like that, you get major respect and make the whole Jesus-faith look good.</w:t>
             </w:r>
           </w:p>
         </w:tc>
@@ -1480,7 +1480,7 @@
               <w:rPr>
                 <w:sz w:val="18"/>
               </w:rPr>
-              <w:t>교회 서포트팀, 집사들도 마찬가지야. 진짜여야 해 — 가짜나 드라마는 안 돼. 술을 너무 많이 마시거나 이득만 노리는 사람도 안 돼. 믿음의 큰 비밀에 온전히 헌신하고, 지위 이용해 위에서 군림하려는 것도 안 돼. 일단 검증부터 받아. 될 만하면 받아들이는 거야. 이건 남자들만의 클럽이 아니야. 여자들도 같은 기준을 충족해야 해. 진지하고, 믿음직하고, 험담하지 않고, 술도 너무 많이 마시지 않아야 해. 팀 전체가 가족에게 충실하고 삶을 잘 정리해야 해. 그렇게 섬기면 큰 존경을 받고, 예수 믿음 전체를 멋지게 보이게 하는 거야.</w:t>
+              <w:t>교회 서포트팀, 집사들도 마찬가지야. 진짜여야 해 — 가짜나 드라마는 안 돼. 술을 너무 많이 마시거나 이득만 노리는 사람도 안 돼. 믿음의 비밀을 경외하고, 지위 이용해 위에서 군림하려는 것도 안 돼. 일단 검증부터 받아. 될 만하면 받아들이는 거야. 이건 남자들만의 클럽이 아니야. 여자들도 같은 기준을 충족해야 해. 진지하고, 믿음직하고, 말을 함부로 하지 않고, 술도 너무 많이 마시지 않아야 해. 팀 전체가 배우자에게 충실하고, 자녀들을 잘 챙기고, 삶을 잘 정리해야 해. 그렇게 섬기면 큰 존경을 받고, 예수 믿음 전체를 멋지게 보이게 하는 거야.</w:t>
             </w:r>
           </w:p>
         </w:tc>
@@ -1536,7 +1536,7 @@
               <w:rPr>
                 <w:sz w:val="18"/>
               </w:rPr>
-              <w:t>I'm hoping to swing by and see you soon, but I'm writing this down just in case I get held up. This is the playbook for how we do things in God's family, the church of the living God, which is like the ultimate fortress of truth. This whole Christian thing is a huge mystery, way bigger than we can get our heads around, but some parts are crystal clear. Like how Jesus showed up as a regular guy, the Holy Spirit proved he was the real deal, and angels saw the whole thing. His story was told to everyone, people all over the world started believing in him, and then he had the ultimate transformation and went back to heaven.</w:t>
+              <w:t>I'm hoping to swing by and see you soon, but I'm writing this down just in case I get held up. This is the playbook for how we do things in God's family, the church of the living God, which is like the ultimate fortress of truth. This whole Christian thing is a huge mystery, way bigger than we can get our heads around, but some parts are crystal clear. Like how Jesus showed up as a regular guy, the invisible Holy Spirit proved he was the real deal, and angels saw the whole thing. He was proclaimed to all kinds of people, people all over the world started believing in him, and then he was taken up into heavenly glory.</w:t>
             </w:r>
           </w:p>
         </w:tc>
@@ -1559,7 +1559,7 @@
               <w:rPr>
                 <w:sz w:val="18"/>
               </w:rPr>
-              <w:t>곧 만나러 가길 바라지만, 혹시 늦어질까 봐 미리 적어 둬. 이건 살아 계신 하나님의 교회, 하나님의 가족 안에서 우리가 어떻게 해야 하는지에 대한 플레이북이야. 교회는 진리의 최고의 요새 같은 거지. 이 기독교라는 건 엄청난 비밀이야, 우리가 다 이해하기엔 너무 크지만, 어떤 부분은 완전 분명해. 예수님이 평범한 사람으로 오셨고, 성령님이 그분이 진짜라는 걸 증명해 주셨고, 천사들이 다 봤다는 거. 그분의 이야기가 모든 사람에게 전해졌고, 전 세계 사람들이 믿기 시작했고, 그분이 최고의 변화를 겪고 하늘로 돌아가셨다는 거야.</w:t>
+              <w:t>곧 만나러 가길 바라지만, 혹시 늦어질까 봐 미리 적어 둬. 이건 살아 계신 하나님의 교회, 하나님의 가족 안에서 우리가 어떻게 해야 하는지에 대한 플레이북이야. 교회는 진리의 최고의 요새 같은 거지. 이 기독교라는 건 엄청난 비밀이야, 우리가 다 이해하기엔 너무 크지만, 어떤 부분은 완전 분명해. 예수님이 평범한 사람으로 오셨고, 보이지 않는 성령님이 그분이 진짜임을 증명해 주셨고, 천사들이 다 봤다는 거. 그분이 모든 민족에게 선포되었고, 전 세계 사람들이 믿기 시작했고, 그분이 하늘의 영광으로 들려 올라가셨다는 거야.</w:t>
             </w:r>
           </w:p>
         </w:tc>
@@ -1737,7 +1737,7 @@
               <w:rPr>
                 <w:sz w:val="18"/>
               </w:rPr>
-              <w:t>Alright, so the Holy Spirit is dropping some major truth bombs. He's saying that down the road, some people are gonna totally ghost the faith. They'll get catfished by demons and start believing a bunch of fake news from professional liars. These guys have been capping for so long, they don't even know what's real anymore. They'll try to tell you not to get married or that you can't eat certain foods. But that's nonsense! God made all that food to be enjoyed with a grateful heart, especially by those of us who are in the know. Everything God created is a banger, and we should be thankful for it. Nothing should be dissed or thrown out. God's Word and our prayers make everything legit.</w:t>
+              <w:t>Alright, so the Holy Spirit is dropping some major truth bombs. He's saying that down the road, some people are gonna totally ghost the faith. They'll get catfished by demons and start believing a bunch of fake news from professional liars. These guys have been capping for so long, they don't even know what's real anymore. They'll try to tell you not to get married or that you can't eat certain foods. But that's nonsense! God made all that food to be enjoyed with a grateful heart, especially by those of us who are in the know. Everything God created is a banger, and we should be thankful for it. Nothing should be dissed or thrown out. God's Word and our prayers make every item in creation holy.</w:t>
             </w:r>
           </w:p>
         </w:tc>
@@ -1808,7 +1808,7 @@
               <w:rPr>
                 <w:sz w:val="18"/>
               </w:rPr>
-              <w:t>If you pass this on to the squad, you'll be a real one for Jesus. You've been raised on the truth of the faith and solid teaching, so you know what's up. Don't get sidetracked by cringey stories that people try to pass off as religion. Instead, you gotta train every day to be spiritually swole. Hitting the gym is cool and all, but a disciplined life in God is a miraculous transformation that makes you fit for today and forever. That's a fact, so take it seriously. This is why we're going all in on this mission. We're betting everything on the living God, the GOAT who saves everyone, especially those who believe.</w:t>
+              <w:t>If you pass this on to the squad, you'll be a real one for Jesus. You've been raised on the truth of the faith and solid teaching, so you know what's up. Don't get sidetracked by cringey stories that people try to pass off as religion. Instead, you gotta train every day to be spiritually swole. Hitting the gym is cool and all, but a disciplined life in God is way more useful, making you fit for today and forever. That's a fact, so take it seriously. This is why we're going all in on this mission. We're betting everything on the living God, the GOAT who saves everyone, especially those who believe.</w:t>
             </w:r>
           </w:p>
         </w:tc>
@@ -1879,7 +1879,7 @@
               <w:rPr>
                 <w:sz w:val="18"/>
               </w:rPr>
-              <w:t>So, get the word out and teach everyone these things. And don't let anyone look down on you because you're young. You gotta lead the charge and show other believers how it's done. Be a role model with your words, your actions, your love, your faith, and your integrity. Keep reading the Scriptures, giving good advice, and teaching. And that special power you got when the church leaders laid hands on you and prayed for you? Keep that skill sharp and ready to use.</w:t>
+              <w:t>So, get the word out and teach everyone these things. And don't let anyone look down on you because you're young. You gotta lead the charge and show other believers how it's done. Be a role model with your words, your actions, your love, your faith, and your integrity. Keep reading the Scriptures, giving good advice, and teaching. And that special gift of ministry you got when the church leaders laid hands on you and prayed for you? Keep that gift dusted off and in use.</w:t>
             </w:r>
           </w:p>
         </w:tc>
@@ -1902,7 +1902,7 @@
               <w:rPr>
                 <w:sz w:val="18"/>
               </w:rPr>
-              <w:t>그러니까 이걸 널리 알려서 모두에게 가르쳐. 그리고 어리다고 아무도 널 무시하게 두지 마. 앞장서서 다른 믿는 사람들에게 어떻게 하는 건지 보여 줘야 해. 말과 행동과 사랑과 믿음과 정직함으로 본보기가 돼. 성경을 계속 읽고, 좋은 조언을 주고, 가르치는 일을 계속해. 교회 리더들이 안수하고 기도하면서 너한테 준 그 특별한 능력? 그 스킬을 날카롭게 갈고 준비해 둬.</w:t>
+              <w:t>그러니까 이걸 널리 알려서 모두에게 가르쳐. 그리고 어리다고 아무도 널 무시하게 두지 마. 앞장서서 다른 믿는 사람들에게 어떻게 하는 건지 보여 줘야 해. 말과 행동과 사랑과 믿음과 정직함으로 본보기가 돼. 성경을 계속 읽고, 좋은 조언을 주고, 가르치는 일을 계속해. 교회 리더들이 안수하고 기도하면서 너한테 준 사역의 그 특별한 선물? 그 선물을 잘 닦아서 계속 사용해.</w:t>
             </w:r>
           </w:p>
         </w:tc>
@@ -1984,7 +1984,7 @@
         <w:pStyle w:val="Heading1"/>
       </w:pPr>
       <w:r>
-        <w:t>Chapter 5 — The Real honored ones and How to Treat 'Em</w:t>
+        <w:t>Chapter 5 — The Real Ones to Honor and How to Treat 'Em</w:t>
       </w:r>
     </w:p>
     <w:tbl>
@@ -2222,7 +2222,7 @@
               <w:rPr>
                 <w:sz w:val="18"/>
               </w:rPr>
-              <w:t>Now, about the widows. You gotta look out for the ones who are truly on their own. If a widow's got family, they need to step up and take care of her. That's like, Christianity 101—your faith starts at home. It's like paying back your parents for all the stuff they did for you, and God is super into that. You can spot a real-deal widow because she's all-in on God, always praying for everyone. But if a widow is just playing people for their money, she's a fake. Make sure everyone knows this so they do the right thing. If you don't take care of your own family, you're basically ghosting your faith, which is even worse than not believing in the first place.</w:t>
+              <w:t>Now, about the widows. You gotta look out for the ones who are truly on their own. If a widow's got family, they need to step up and take care of her. That's like, Christianity 101—your faith starts at home. It's like paying back your parents for all the stuff they did for you, and God is super into that. You can spot a real-deal widow because she's all-in on God, always praying — for others' needs and her own. But if a widow is just playing people for their money, she's a fake. Make sure everyone knows this so they do the right thing by their extended family. If you don't take care of your own family, you're basically ghosting your faith, which is even worse than not believing in the first place.</w:t>
             </w:r>
           </w:p>
         </w:tc>
@@ -2364,7 +2364,7 @@
               <w:rPr>
                 <w:sz w:val="18"/>
               </w:rPr>
-              <w:t>But don't put the young widows on this list. They'll join up and then immediately be like, 'I'd rather have a husband,' obsessed with finding a husband instead of serving Christ this way. They'll break their promise and just get into drama, wasting their time with gossip and nonsense. Seriously, it's better for the young widows to just get married, have kids, run their homes, and not give the haters anything to talk about. Some of them have already bailed and are following Satan.</w:t>
+              <w:t>But don't put the young widows on this list. They'll join up and then immediately be like, 'I'd rather have a husband,' obsessed with finding a husband instead of serving Christ this way. They'll break their promise and spiral from bad to worse, wasting their time with gossip and nonsense. Seriously, it's better for the young widows to just get married, have kids, run their homes, and not give the haters anything to talk about. Some of them have already bailed and are following Satan.</w:t>
             </w:r>
           </w:p>
         </w:tc>
@@ -2387,7 +2387,7 @@
               <w:rPr>
                 <w:sz w:val="18"/>
               </w:rPr>
-              <w:t>근데 젊은 과부들은 이 명단에 올리지 마. 등록하자마자 '남편이랑 결혼하고 싶어요' 이러면서, 그리스도를 이렇게 섬기는 대신 남편 찾기에만 집착할 거야. 약속을 깨고 드라마나 만들고, 험담이랑 쓸데없는 일로 시간을 낭비할 거야. 솔직히 젊은 과부들은 그냥 결혼해서 아이 낳고, 집안일 잘하고, 욕하는 사람들에게 빌미를 주지 않는 게 나아. 어떤 사람들은 이미 떠나서 사탄을 따르고 있어.</w:t>
+              <w:t>근데 젊은 과부들은 이 명단에 올리지 마. 등록하자마자 '남편이랑 결혼하고 싶어요' 이러면서, 그리스도를 이렇게 섬기는 대신 남편 찾기에만 집착할 거야. 약속을 깨고 점점 더 나빠지면서, 험담이랑 쓸데없는 일로 시간을 낭비할 거야. 솔직히 젊은 과부들은 그냥 결혼해서 아이 낳고, 집안일 잘하고, 욕하는 사람들에게 빌미를 주지 않는 게 나아. 어떤 사람들은 이미 떠나서 사탄을 따르고 있어.</w:t>
             </w:r>
           </w:p>
         </w:tc>
@@ -2435,7 +2435,7 @@
               <w:rPr>
                 <w:sz w:val="18"/>
               </w:rPr>
-              <w:t>And if a Christian woman has widows in her family, she's gotta take care of them. Don't just dump them on the church. The church has its hands full with the widows who have nobody.</w:t>
+              <w:t>And if a Christian woman has widows in her family, she's gotta take care of them. Don't just dump them on the church. The church has its hands full with the widows who really need help.</w:t>
             </w:r>
           </w:p>
         </w:tc>
@@ -2719,7 +2719,7 @@
               <w:rPr>
                 <w:sz w:val="18"/>
               </w:rPr>
-              <w:t>I'm telling you this with God, Jesus, and all the angels as my witnesses: follow these instructions and don't play favorites. Don't be in a rush to make someone a leader. If you do, you might end up being part of their mess. Keep yourself clean. And hey, don't let the critics get to you. A little wine is fine; it's good for your stomach and can help you feel better.</w:t>
+              <w:t>I'm telling you this with God, Jesus, and all the angels as my witnesses: follow these instructions — no favoritism, no taking sides. Don't be in a rush to make someone a leader. If you do, you might end up being part of their mess. Keep a close watch on yourself. And hey, don't let the critics get to you. A little wine is fine; it's good for your stomach and can help you feel better.</w:t>
             </w:r>
           </w:p>
         </w:tc>
@@ -2742,7 +2742,7 @@
               <w:rPr>
                 <w:sz w:val="18"/>
               </w:rPr>
-              <w:t>하나님과 예수님과 모든 천사들이 증인이야. 이 지시를 따르고 편애하지 마. 리더 세우는 걸 서두르지 마. 서두르면 그 사람의 문제에 네가 엮일 수도 있어. 너 자신은 깨끗하게 지켜. 그리고 비판하는 사람들 말에 너무 신경 쓰지 마. 와인 조금은 괜찮아. 소화에 좋고 몸에도 약이 돼.</w:t>
+              <w:t>하나님과 예수님과 모든 천사들이 증인이야. 이 지시를 따르고, 편애하지도 편들지도 마. 리더 세우는 걸 서두르지 마. 서두르면 그 사람의 문제에 네가 엮일 수도 있어. 너 자신은 단단히 점검해. 그리고 비판하는 사람들 말에 너무 신경 쓰지 마. 와인 조금은 괜찮아. 소화에 좋고 몸에도 약이 돼.</w:t>
             </w:r>
           </w:p>
         </w:tc>
@@ -3338,7 +3338,7 @@
               <w:rPr>
                 <w:sz w:val="18"/>
               </w:rPr>
-              <w:t>But you, Timothy, you're a man of God. You need to run from all that nonsense. Go hard after a righteous life — a life of wonder, faith, love, steadiness, and courtesy. Stay in the game, run your race, and grab that eternal life you were called to, the one you told everyone you were all-in for.</w:t>
+              <w:t>But you, Timothy, you're a man of God. You need to run from all that nonsense. Go hard after a righteous life — a life of wonder, faith, love, steadiness, and courtesy. Stay in the game, run your race, and grab that eternal life you were called to, the one you embraced so fervently in front of so many witnesses.</w:t>
             </w:r>
           </w:p>
         </w:tc>
@@ -3409,7 +3409,7 @@
               <w:rPr>
                 <w:sz w:val="18"/>
               </w:rPr>
-              <w:t>I'm giving you a serious mission, in front of God who gives life and Jesus who stood his ground and didn't back down from Pontius Pilate: Stick to the plan. Don't slack off. Our main man, Jesus Christ, is coming back right on schedule. His return is guaranteed by the Blessed and Undisputed Ruler, the King of all kings and Lord of all lords. He's the only one who can't be defeated by death, shining so bright you can't even look at him. No one has ever seen him, 'cause he's on another level. All honor and power to him forever! You know it.</w:t>
+              <w:t>I'm giving you a serious mission, in front of God who gives life and Jesus who stood his ground and didn't back down from Pontius Pilate: Keep this command to the letter. Don't slack off. Our Master, Jesus Christ, is coming back right on schedule. His return is guaranteed by the Blessed and Undisputed Ruler, the High King, the High God. He's the only one who can't be defeated by death, shining so bright you can't even look at him. No one has ever seen him, 'cause he's on another level. Honor to him, and eternal rule forever! You know it.</w:t>
             </w:r>
           </w:p>
         </w:tc>
@@ -3480,7 +3480,7 @@
               <w:rPr>
                 <w:sz w:val="18"/>
               </w:rPr>
-              <w:t>And tell the rich people in this world to chill out. They need to stop flexing and being obsessed with their money, 'cause it can all disappear tomorrow. Tell them to chase after God, who gives us way more than we could ever handle. They should use their wealth to do good, be super generous, and help others out. That's how they build up real treasure that lasts forever and get a life that's actually worth living.</w:t>
+              <w:t>And tell the rich people in this world to chill out. They need to stop flexing and being obsessed with their money, 'cause it can all disappear tomorrow. Tell them to chase after God, who gives us way more than we could ever handle. They should use their wealth to do good, be super generous, and help others out. That's how they build up real treasure that lasts forever and gain the life that is truly life.</w:t>
             </w:r>
           </w:p>
         </w:tc>
@@ -3503,7 +3503,7 @@
               <w:rPr>
                 <w:sz w:val="18"/>
               </w:rPr>
-              <w:t>그리고 이 세상의 부자들에게 전해. 잘난 척 그만하고 돈에 집착하지 말라고. 돈은 오늘 있다가 내일 사라질 수 있으니까. 하나님을 쫓으라고 전해. 하나님이 우리가 감당할 수 있는 것보다 훨씬 많은 부를 쌓아 주시니까. 선을 행하고, 남 돕는 데 부자가 되고, 엄청나게 너그러워지라고. 그렇게 하면 오래가는 진짜 보물을 쌓게 되고, 진짜 삶다운 삶을 얻게 될 거야.</w:t>
+              <w:t>그리고 이 세상의 부자들에게 전해. 잘난 척 그만하고 돈에 집착하지 말라고. 돈은 오늘 있다가 내일 사라질 수 있으니까. 하나님을 쫓으라고 전해. 하나님이 우리가 감당할 수 있는 것보다 훨씬 많은 부를 쌓아 주시니까. 선을 행하고, 남 돕는 데 부자가 되고, 엄청나게 너그러워지라고. 그렇게 하면 오래가는 진짜 보물을 쌓게 되고, 진짜 생명인 그 삶을 얻게 될 거야.</w:t>
             </w:r>
           </w:p>
         </w:tc>
@@ -3559,7 +3559,7 @@
               <w:rPr>
                 <w:sz w:val="18"/>
               </w:rPr>
-              <w:t>And yo, Timothy, my man. Guard the treasure you've been given — guard it with your life! Don't get sucked into all the pointless arguments and fake knowledge from the so-called 'experts.' People who get caught up in all that talk can totally miss the point of faith. Overwhelming grace keep you!</w:t>
+              <w:t>And yo, Timothy, my man. Guard the treasure you've been given — guard it with your life! Don't get sucked into talk-show religion and the practiced confusion of the so-called 'experts.' People who get caught up in all that talk can totally miss the point of faith. Overwhelming grace keep you!</w:t>
             </w:r>
           </w:p>
         </w:tc>

</xml_diff>

<commit_message>
1Timothy 2nd in-depth re-review (Sep 25): 2 restorations + 1 KO parity fix — ch3 1-7 EN/KO restored 'attentive to his own children' (1st kept only 'respect'); ch4 6-10 KO '기적 같은 변화야' -> '훨씬 더 유용해' (1st removed 'miraculous transformation' from EN only, KO still had the dropped concept). validate PASS, build ALL VERIFY OK, GDocs 6/6 export-back verified
</commit_message>
<xml_diff>
--- a/gdocs_build/1Timothy.docx
+++ b/gdocs_build/1Timothy.docx
@@ -1332,7 +1332,7 @@
               <w:rPr>
                 <w:sz w:val="18"/>
               </w:rPr>
-              <w:t>So, you wanna be a leader at church? That's legit. But hold up, it's not like they're just handing out special access. There are some ground rules. First, you gotta have a good rep. People need to know you're a solid guy. You gotta be a one-woman man, stay chill, and be the kind of guy people can actually talk to, who welcomes people into his home. And yeah, you need to know your stuff when it comes to God. Don't be hitting the bottle too hard, and definitely don't be pushy. Be gentle, don't get triggered by everything, and don't be greedy. You've got to have your own life on lock, and your own kids have to actually look up to you. Seriously, if your own house is a mess, how are you gonna run God's house? Also, you can't be a rookie Christian; that's a surefire way to get a big ego and let the Devil trip you up. Even people who aren't into church should think you're a decent guy, or the Devil will find a way to trap you.</w:t>
+              <w:t>So, you wanna be a leader at church? That's legit. But hold up, it's not like they're just handing out special access. There are some ground rules. First, you gotta have a good rep. People need to know you're a solid guy. You gotta be a one-woman man, stay chill, and be the kind of guy people can actually talk to, who welcomes people into his home. And yeah, you need to know your stuff when it comes to God. Don't be hitting the bottle too hard, and definitely don't be pushy. Be gentle, don't get triggered by everything, and don't be greedy. You've got to have your own life on lock, and take good care of your kids — they should actually look up to you. Seriously, if your own house is a mess, how are you gonna run God's house? Also, you can't be a rookie Christian; that's a surefire way to get a big ego and let the Devil trip you up. Even people who aren't into church should think you're a decent guy, or the Devil will find a way to trap you.</w:t>
             </w:r>
           </w:p>
         </w:tc>
@@ -1355,7 +1355,7 @@
               <w:rPr>
                 <w:sz w:val="18"/>
               </w:rPr>
-              <w:t>교회에서 리더가 되고 싶어? 좋은 생각이야. 근데 잠깐, 아무나 주는 게 아니야. 기본 조건이 있어. 첫째, 평판이 좋아야 해. 사람들이 너를 믿을 만한 사람으로 알아야지. 한 여자에게 충실하고, 침착하고, 사람들이 편하게 다가갈 수 있고, 손님을 잘 맞이하는 사람이어야 해. 하나님에 대해선 확실히 알아야 하고. 술고래가 아니고, 밀어붙이지 말고, 부드럽게, 별거 아닌 일에 욱하지 말고, 탐욕 부리지도 말고. 자기 집안일도 잘 챙기고, 자기 아이들이 진짜로 존경해야 해. 진짜로, 자기 집도 못 건사하면서 어떻게 하나님의 집을 돌보겠어? 또 신앙 초보도 안 돼. 자만심이 하늘을 찌르고 마귀한테 넘어가기 딱 좋아. 교회 안 다니는 사람들한테도 괜찮은 사람으로 보여야 해. 그렇지 않으면 마귀가 널 덫에 빠뜨릴 방법을 찾을 거야.</w:t>
+              <w:t>교회에서 리더가 되고 싶어? 좋은 생각이야. 근데 잠깐, 아무나 주는 게 아니야. 기본 조건이 있어. 첫째, 평판이 좋아야 해. 사람들이 너를 믿을 만한 사람으로 알아야지. 한 여자에게 충실하고, 침착하고, 사람들이 편하게 다가갈 수 있고, 손님을 잘 맞이하는 사람이어야 해. 하나님에 대해선 확실히 알아야 하고. 술고래가 아니고, 밀어붙이지 말고, 부드럽게, 별거 아닌 일에 욱하지 말고, 탐욕 부리지도 말고. 자기 집안일도 잘 챙기고, 자기 아이들을 잘 돌봐야 해. 아이들이 진짜로 존경해야 하고, 진짜로, 자기 집도 못 건사하면서 어떻게 하나님의 집을 돌보겠어? 또 신앙 초보도 안 돼. 자만심이 하늘을 찌르고 마귀한테 넘어가기 딱 좋아. 교회 안 다니는 사람들한테도 괜찮은 사람으로 보여야 해. 그렇지 않으면 마귀가 널 덫에 빠뜨릴 방법을 찾을 거야.</w:t>
             </w:r>
           </w:p>
         </w:tc>
@@ -1759,7 +1759,7 @@
               <w:rPr>
                 <w:sz w:val="18"/>
               </w:rPr>
-              <w:t>이걸 팀원들에게 전하면 넌 진짜 예수님의 사람이야. 너는 믿음의 진리와 탄탄한 가르침으로 자랐으니까 뭔지 알잖아. 종교인 척 포장한 유치한 이야기에 빠지지 마. 대신 매일 훈련해서 영적으로 단단해져야 해. 헬스 가는 것도 좋긴 한데, 하나님 안에서의 절제된 삶은 기적 같은 변화야. 오늘도 영원히도 너를 fit하게 만들어 주지. 이건 팩트니까 진지하게 받아들여. 그래서 우리가 이 미션에 모든 걸 거는 거야. 살아 계신 하나님, 모두의 구원자, 특히 믿는 사람들의 구원자에게 모든 걸 거는 거야.</w:t>
+              <w:t>이걸 팀원들에게 전하면 넌 진짜 예수님의 사람이야. 너는 믿음의 진리와 탄탄한 가르침으로 자랐으니까 뭔지 알잖아. 종교인 척 포장한 유치한 이야기에 빠지지 마. 대신 매일 훈련해서 영적으로 단단해져야 해. 헬스 가는 것도 좋긴 한데, 하나님 안에서의 절제된 삶은 훨씬 더 유용해. 오늘도 영원히도 너를 fit하게 만들어 주지. 이건 팩트니까 진지하게 받아들여. 그래서 우리가 이 미션에 모든 걸 거는 거야. 살아 계신 하나님, 모두의 구원자, 특히 믿는 사람들의 구원자에게 모든 걸 거는 거야.</w:t>
             </w:r>
           </w:p>
         </w:tc>

</xml_diff>

<commit_message>
배지 수정 반영 docx 재생성: Ephesians, 1Timothy
</commit_message>
<xml_diff>
--- a/gdocs_build/1Timothy.docx
+++ b/gdocs_build/1Timothy.docx
@@ -493,7 +493,7 @@
                 <w:b/>
                 <w:sz w:val="16"/>
               </w:rPr>
-              <w:t>15-19</w:t>
+              <w:t>15-16</w:t>
             </w:r>
           </w:p>
           <w:p>
@@ -532,7 +532,7 @@
                 <w:b/>
                 <w:sz w:val="16"/>
               </w:rPr>
-              <w:t>15-19</w:t>
+              <w:t>15-16</w:t>
             </w:r>
           </w:p>
           <w:p>
@@ -555,7 +555,7 @@
                 <w:b/>
                 <w:sz w:val="16"/>
               </w:rPr>
-              <w:t>15-19</w:t>
+              <w:t>15-16</w:t>
             </w:r>
           </w:p>
           <w:p>
@@ -580,7 +580,7 @@
                 <w:b/>
                 <w:sz w:val="16"/>
               </w:rPr>
-              <w:t>15-19</w:t>
+              <w:t>17</w:t>
             </w:r>
           </w:p>
           <w:p>
@@ -603,7 +603,7 @@
                 <w:b/>
                 <w:sz w:val="16"/>
               </w:rPr>
-              <w:t>15-19</w:t>
+              <w:t>17</w:t>
             </w:r>
           </w:p>
           <w:p>
@@ -626,7 +626,7 @@
                 <w:b/>
                 <w:sz w:val="16"/>
               </w:rPr>
-              <w:t>15-19</w:t>
+              <w:t>17</w:t>
             </w:r>
           </w:p>
           <w:p>
@@ -651,7 +651,7 @@
                 <w:b/>
                 <w:sz w:val="16"/>
               </w:rPr>
-              <w:t>15-19</w:t>
+              <w:t>18-19</w:t>
             </w:r>
           </w:p>
           <w:p>
@@ -674,7 +674,7 @@
                 <w:b/>
                 <w:sz w:val="16"/>
               </w:rPr>
-              <w:t>15-19</w:t>
+              <w:t>18-19</w:t>
             </w:r>
           </w:p>
           <w:p>
@@ -697,7 +697,7 @@
                 <w:b/>
                 <w:sz w:val="16"/>
               </w:rPr>
-              <w:t>15-19</w:t>
+              <w:t>18-19</w:t>
             </w:r>
           </w:p>
           <w:p>

</xml_diff>